<commit_message>
docs: re-ejecución del plan de pruebas tras corregir los defectos (#77)
Sección 6 y Tabla 12: 62 aprobados, 0 fallidos y 1 pendiente después de la corrección. La Tabla 10 ahora describe la corrección aplicada.

Co-Authored-By: Claude Opus 5.5 <noreply@anthropic.com>
</commit_message>
<xml_diff>
--- a/docs/Sprint 3/Plan_de_Casos_de_Prueba_Sprint3_Los_Primos.docx
+++ b/docs/Sprint 3/Plan_de_Casos_de_Prueba_Sprint3_Los_Primos.docx
@@ -19268,7 +19268,7 @@
           <w:sz w:val="22"/>
           <w:szCs w:val="22"/>
         </w:rPr>
-        <w:t xml:space="preserve">La Tabla 9 relaciona cada módulo con la tarea del Sprint 3 y la issue de GitHub que lo implementó, y resume el resultado de la ejecución: de 63 casos, 59 resultaron aprobados, 3 fallidos y 1 quedó pendiente.</w:t>
+        <w:t xml:space="preserve">La Tabla 9 relaciona cada módulo con la tarea del Sprint 3 y la issue de GitHub que lo implementó, y resume el resultado de la primera ejecución: de 63 casos, 59 resultaron aprobados, 3 fallidos y 1 quedó pendiente.</w:t>
       </w:r>
     </w:p>
     <w:p>
@@ -19300,7 +19300,7 @@
           <w:sz w:val="22"/>
           <w:szCs w:val="22"/>
         </w:rPr>
-        <w:t xml:space="preserve">Trazabilidad de los casos y resumen de la ejecución</w:t>
+        <w:t xml:space="preserve">Trazabilidad de los casos y resumen de la primera ejecución</w:t>
       </w:r>
     </w:p>
     <w:tbl>
@@ -21771,7 +21771,7 @@
                 <w:sz w:val="16"/>
                 <w:szCs w:val="16"/>
               </w:rPr>
-              <w:t xml:space="preserve">Corrección propuesta</w:t>
+              <w:t xml:space="preserve">Corrección aplicada (#77)</w:t>
             </w:r>
           </w:p>
         </w:tc>
@@ -21878,7 +21878,7 @@
                 <w:sz w:val="16"/>
                 <w:szCs w:val="16"/>
               </w:rPr>
-              <w:t xml:space="preserve">Descartar en leerCarrito() los ítems cuya cantidad no sea un entero entre 1 y 20 (js/carrito.js).</w:t>
+              <w:t xml:space="preserve">Nueva función esItemValido() en js/carrito.js: leerCarrito() descarta los ítems sin id numérico o cuya cantidad no sea un entero entre 1 y 20.</w:t>
             </w:r>
           </w:p>
         </w:tc>
@@ -21988,7 +21988,7 @@
                 <w:sz w:val="16"/>
                 <w:szCs w:val="16"/>
               </w:rPr>
-              <w:t xml:space="preserve">Agregar al campo un atributo pattern con el formato LP-000000 y un title explicativo (arrepentimiento.html).</w:t>
+              <w:t xml:space="preserve">Atributos pattern="[Ll][Pp]-[0-9]{6}", title con el formato esperado y maxlength="9" en el campo (arrepentimiento.html).</w:t>
             </w:r>
           </w:p>
         </w:tc>
@@ -22095,7 +22095,7 @@
                 <w:sz w:val="16"/>
                 <w:szCs w:val="16"/>
               </w:rPr>
-              <w:t xml:space="preserve">Aplicar overflow-wrap: anywhere a los links del texto legal o acortar el texto visible del link (css/styles.css).</w:t>
+              <w:t xml:space="preserve">Regla overflow-wrap: anywhere en los links de .texto-legal (css/styles.css), que permite cortar las URL largas.</w:t>
             </w:r>
           </w:p>
         </w:tc>
@@ -22596,6 +22596,842 @@
         </w:tc>
       </w:tr>
     </w:tbl>
+    <w:p>
+      <w:pPr>
+        <w:pStyle w:val="Heading2"/>
+        <w:keepNext/>
+        <w:spacing w:before="240" w:after="0" w:line="480"/>
+        <w:jc w:val="center"/>
+      </w:pPr>
+      <w:r>
+        <w:rPr>
+          <w:rFonts w:ascii="Calibri" w:cs="Calibri" w:eastAsia="Calibri" w:hAnsi="Calibri"/>
+          <w:b/>
+          <w:bCs/>
+          <w:sz w:val="22"/>
+          <w:szCs w:val="22"/>
+        </w:rPr>
+        <w:t xml:space="preserve">6. Corrección y re-ejecución</w:t>
+      </w:r>
+    </w:p>
+    <w:p>
+      <w:pPr>
+        <w:spacing w:after="0" w:line="480"/>
+        <w:ind w:firstLine="720"/>
+      </w:pPr>
+      <w:r>
+        <w:rPr>
+          <w:rFonts w:ascii="Calibri" w:cs="Calibri" w:eastAsia="Calibri" w:hAnsi="Calibri"/>
+          <w:sz w:val="22"/>
+          <w:szCs w:val="22"/>
+        </w:rPr>
+        <w:t xml:space="preserve">Los tres defectos se corrigieron el 20/10/2026 en la issue #77 del repositorio (Pull Request #78), con un commit por defecto. Después de la corrección se volvió a ejecutar el plan completo de 63 casos con el mismo script y el mismo entorno, para confirmar que los defectos quedaron resueltos y que los cambios no afectaron funcionalidades que ya estaban aprobadas (prueba de regresión).</w:t>
+      </w:r>
+    </w:p>
+    <w:p>
+      <w:pPr>
+        <w:spacing w:after="0" w:line="480"/>
+        <w:ind w:firstLine="720"/>
+      </w:pPr>
+      <w:r>
+        <w:rPr>
+          <w:rFonts w:ascii="Calibri" w:cs="Calibri" w:eastAsia="Calibri" w:hAnsi="Calibri"/>
+          <w:sz w:val="22"/>
+          <w:szCs w:val="22"/>
+        </w:rPr>
+        <w:t xml:space="preserve">Resultado de la re-ejecución: 62 casos aprobados, 0 fallidos y 1 pendiente (CP-RES-07, que requiere un celular real). La Tabla 12 compara el resultado de los casos corregidos en ambas ejecuciones.</w:t>
+      </w:r>
+    </w:p>
+    <w:p>
+      <w:pPr>
+        <w:keepNext/>
+        <w:spacing w:before="240" w:after="0" w:line="480"/>
+      </w:pPr>
+      <w:r>
+        <w:rPr>
+          <w:rFonts w:ascii="Calibri" w:cs="Calibri" w:eastAsia="Calibri" w:hAnsi="Calibri"/>
+          <w:b/>
+          <w:bCs/>
+          <w:sz w:val="22"/>
+          <w:szCs w:val="22"/>
+        </w:rPr>
+        <w:t xml:space="preserve">Tabla 12</w:t>
+      </w:r>
+    </w:p>
+    <w:p>
+      <w:pPr>
+        <w:keepNext/>
+        <w:spacing w:after="0" w:line="480"/>
+      </w:pPr>
+      <w:r>
+        <w:rPr>
+          <w:rFonts w:ascii="Calibri" w:cs="Calibri" w:eastAsia="Calibri" w:hAnsi="Calibri"/>
+          <w:i/>
+          <w:iCs/>
+          <w:sz w:val="22"/>
+          <w:szCs w:val="22"/>
+        </w:rPr>
+        <w:t xml:space="preserve">Resultado de los casos corregidos antes y después de la corrección</w:t>
+      </w:r>
+    </w:p>
+    <w:tbl>
+      <w:tblPr>
+        <w:tblW w:type="dxa" w:w="13958"/>
+        <w:tblBorders>
+          <w:top w:val="single" w:color="auto" w:sz="4"/>
+          <w:left w:val="single" w:color="auto" w:sz="4"/>
+          <w:bottom w:val="single" w:color="auto" w:sz="4"/>
+          <w:right w:val="single" w:color="auto" w:sz="4"/>
+          <w:insideH w:val="single" w:color="auto" w:sz="4"/>
+          <w:insideV w:val="single" w:color="auto" w:sz="4"/>
+        </w:tblBorders>
+      </w:tblPr>
+      <w:tblGrid>
+        <w:gridCol w:w="1400"/>
+        <w:gridCol w:w="4200"/>
+        <w:gridCol w:w="4900"/>
+        <w:gridCol w:w="2458"/>
+        <w:gridCol w:w="1000"/>
+      </w:tblGrid>
+      <w:tr>
+        <w:trPr>
+          <w:tblHeader/>
+        </w:trPr>
+        <w:tc>
+          <w:tcPr>
+            <w:tcW w:type="dxa" w:w="1400"/>
+            <w:tcBorders>
+              <w:top w:val="single" w:color="999999" w:sz="4"/>
+              <w:left w:val="single" w:color="999999" w:sz="4"/>
+              <w:bottom w:val="single" w:color="999999" w:sz="4"/>
+              <w:right w:val="single" w:color="999999" w:sz="4"/>
+            </w:tcBorders>
+            <w:shd w:fill="7A5A12" w:color="auto" w:val="clear"/>
+            <w:tcMar>
+              <w:top w:type="dxa" w:w="60"/>
+              <w:left w:type="dxa" w:w="80"/>
+              <w:bottom w:type="dxa" w:w="60"/>
+              <w:right w:type="dxa" w:w="80"/>
+            </w:tcMar>
+            <w:vAlign w:val="center"/>
+          </w:tcPr>
+          <w:p>
+            <w:pPr>
+              <w:spacing w:after="0"/>
+              <w:jc w:val="center"/>
+            </w:pPr>
+            <w:r>
+              <w:rPr>
+                <w:rFonts w:ascii="Calibri" w:cs="Calibri" w:eastAsia="Calibri" w:hAnsi="Calibri"/>
+                <w:b/>
+                <w:bCs/>
+                <w:color w:val="FFFFFF"/>
+                <w:sz w:val="16"/>
+                <w:szCs w:val="16"/>
+              </w:rPr>
+              <w:t xml:space="preserve">Caso</w:t>
+            </w:r>
+          </w:p>
+        </w:tc>
+        <w:tc>
+          <w:tcPr>
+            <w:tcW w:type="dxa" w:w="4200"/>
+            <w:tcBorders>
+              <w:top w:val="single" w:color="999999" w:sz="4"/>
+              <w:left w:val="single" w:color="999999" w:sz="4"/>
+              <w:bottom w:val="single" w:color="999999" w:sz="4"/>
+              <w:right w:val="single" w:color="999999" w:sz="4"/>
+            </w:tcBorders>
+            <w:shd w:fill="7A5A12" w:color="auto" w:val="clear"/>
+            <w:tcMar>
+              <w:top w:type="dxa" w:w="60"/>
+              <w:left w:type="dxa" w:w="80"/>
+              <w:bottom w:type="dxa" w:w="60"/>
+              <w:right w:type="dxa" w:w="80"/>
+            </w:tcMar>
+            <w:vAlign w:val="center"/>
+          </w:tcPr>
+          <w:p>
+            <w:pPr>
+              <w:spacing w:after="0"/>
+              <w:jc w:val="center"/>
+            </w:pPr>
+            <w:r>
+              <w:rPr>
+                <w:rFonts w:ascii="Calibri" w:cs="Calibri" w:eastAsia="Calibri" w:hAnsi="Calibri"/>
+                <w:b/>
+                <w:bCs/>
+                <w:color w:val="FFFFFF"/>
+                <w:sz w:val="16"/>
+                <w:szCs w:val="16"/>
+              </w:rPr>
+              <w:t xml:space="preserve">Primera ejecución</w:t>
+            </w:r>
+          </w:p>
+        </w:tc>
+        <w:tc>
+          <w:tcPr>
+            <w:tcW w:type="dxa" w:w="4900"/>
+            <w:tcBorders>
+              <w:top w:val="single" w:color="999999" w:sz="4"/>
+              <w:left w:val="single" w:color="999999" w:sz="4"/>
+              <w:bottom w:val="single" w:color="999999" w:sz="4"/>
+              <w:right w:val="single" w:color="999999" w:sz="4"/>
+            </w:tcBorders>
+            <w:shd w:fill="7A5A12" w:color="auto" w:val="clear"/>
+            <w:tcMar>
+              <w:top w:type="dxa" w:w="60"/>
+              <w:left w:type="dxa" w:w="80"/>
+              <w:bottom w:type="dxa" w:w="60"/>
+              <w:right w:type="dxa" w:w="80"/>
+            </w:tcMar>
+            <w:vAlign w:val="center"/>
+          </w:tcPr>
+          <w:p>
+            <w:pPr>
+              <w:spacing w:after="0"/>
+              <w:jc w:val="center"/>
+            </w:pPr>
+            <w:r>
+              <w:rPr>
+                <w:rFonts w:ascii="Calibri" w:cs="Calibri" w:eastAsia="Calibri" w:hAnsi="Calibri"/>
+                <w:b/>
+                <w:bCs/>
+                <w:color w:val="FFFFFF"/>
+                <w:sz w:val="16"/>
+                <w:szCs w:val="16"/>
+              </w:rPr>
+              <w:t xml:space="preserve">Re-ejecución (20/10/2026)</w:t>
+            </w:r>
+          </w:p>
+        </w:tc>
+        <w:tc>
+          <w:tcPr>
+            <w:tcW w:type="dxa" w:w="2458"/>
+            <w:tcBorders>
+              <w:top w:val="single" w:color="999999" w:sz="4"/>
+              <w:left w:val="single" w:color="999999" w:sz="4"/>
+              <w:bottom w:val="single" w:color="999999" w:sz="4"/>
+              <w:right w:val="single" w:color="999999" w:sz="4"/>
+            </w:tcBorders>
+            <w:shd w:fill="7A5A12" w:color="auto" w:val="clear"/>
+            <w:tcMar>
+              <w:top w:type="dxa" w:w="60"/>
+              <w:left w:type="dxa" w:w="80"/>
+              <w:bottom w:type="dxa" w:w="60"/>
+              <w:right w:type="dxa" w:w="80"/>
+            </w:tcMar>
+            <w:vAlign w:val="center"/>
+          </w:tcPr>
+          <w:p>
+            <w:pPr>
+              <w:spacing w:after="0"/>
+              <w:jc w:val="center"/>
+            </w:pPr>
+            <w:r>
+              <w:rPr>
+                <w:rFonts w:ascii="Calibri" w:cs="Calibri" w:eastAsia="Calibri" w:hAnsi="Calibri"/>
+                <w:b/>
+                <w:bCs/>
+                <w:color w:val="FFFFFF"/>
+                <w:sz w:val="16"/>
+                <w:szCs w:val="16"/>
+              </w:rPr>
+              <w:t xml:space="preserve">Commit</w:t>
+            </w:r>
+          </w:p>
+        </w:tc>
+        <w:tc>
+          <w:tcPr>
+            <w:tcW w:type="dxa" w:w="1000"/>
+            <w:tcBorders>
+              <w:top w:val="single" w:color="999999" w:sz="4"/>
+              <w:left w:val="single" w:color="999999" w:sz="4"/>
+              <w:bottom w:val="single" w:color="999999" w:sz="4"/>
+              <w:right w:val="single" w:color="999999" w:sz="4"/>
+            </w:tcBorders>
+            <w:shd w:fill="7A5A12" w:color="auto" w:val="clear"/>
+            <w:tcMar>
+              <w:top w:type="dxa" w:w="60"/>
+              <w:left w:type="dxa" w:w="80"/>
+              <w:bottom w:type="dxa" w:w="60"/>
+              <w:right w:type="dxa" w:w="80"/>
+            </w:tcMar>
+            <w:vAlign w:val="center"/>
+          </w:tcPr>
+          <w:p>
+            <w:pPr>
+              <w:spacing w:after="0"/>
+              <w:jc w:val="center"/>
+            </w:pPr>
+            <w:r>
+              <w:rPr>
+                <w:rFonts w:ascii="Calibri" w:cs="Calibri" w:eastAsia="Calibri" w:hAnsi="Calibri"/>
+                <w:b/>
+                <w:bCs/>
+                <w:color w:val="FFFFFF"/>
+                <w:sz w:val="16"/>
+                <w:szCs w:val="16"/>
+              </w:rPr>
+              <w:t xml:space="preserve">Estado</w:t>
+            </w:r>
+          </w:p>
+        </w:tc>
+      </w:tr>
+      <w:tr>
+        <w:trPr>
+          <w:cantSplit/>
+        </w:trPr>
+        <w:tc>
+          <w:tcPr>
+            <w:tcW w:type="dxa" w:w="1400"/>
+            <w:tcBorders>
+              <w:top w:val="single" w:color="999999" w:sz="4"/>
+              <w:left w:val="single" w:color="999999" w:sz="4"/>
+              <w:bottom w:val="single" w:color="999999" w:sz="4"/>
+              <w:right w:val="single" w:color="999999" w:sz="4"/>
+            </w:tcBorders>
+            <w:tcMar>
+              <w:top w:type="dxa" w:w="60"/>
+              <w:left w:type="dxa" w:w="80"/>
+              <w:bottom w:type="dxa" w:w="60"/>
+              <w:right w:type="dxa" w:w="80"/>
+            </w:tcMar>
+            <w:vAlign w:val="center"/>
+          </w:tcPr>
+          <w:p>
+            <w:pPr>
+              <w:spacing w:after="0"/>
+              <w:jc w:val="center"/>
+            </w:pPr>
+            <w:r>
+              <w:rPr>
+                <w:rFonts w:ascii="Calibri" w:cs="Calibri" w:eastAsia="Calibri" w:hAnsi="Calibri"/>
+                <w:b/>
+                <w:bCs/>
+                <w:sz w:val="16"/>
+                <w:szCs w:val="16"/>
+              </w:rPr>
+              <w:t xml:space="preserve">CP-CAR-14</w:t>
+            </w:r>
+          </w:p>
+        </w:tc>
+        <w:tc>
+          <w:tcPr>
+            <w:tcW w:type="dxa" w:w="4200"/>
+            <w:tcBorders>
+              <w:top w:val="single" w:color="999999" w:sz="4"/>
+              <w:left w:val="single" w:color="999999" w:sz="4"/>
+              <w:bottom w:val="single" w:color="999999" w:sz="4"/>
+              <w:right w:val="single" w:color="999999" w:sz="4"/>
+            </w:tcBorders>
+            <w:tcMar>
+              <w:top w:type="dxa" w:w="60"/>
+              <w:left w:type="dxa" w:w="80"/>
+              <w:bottom w:type="dxa" w:w="60"/>
+              <w:right w:type="dxa" w:w="80"/>
+            </w:tcMar>
+            <w:vAlign w:val="center"/>
+          </w:tcPr>
+          <w:p>
+            <w:pPr>
+              <w:spacing w:after="0"/>
+              <w:jc w:val="left"/>
+            </w:pPr>
+            <w:r>
+              <w:rPr>
+                <w:rFonts w:ascii="Calibri" w:cs="Calibri" w:eastAsia="Calibri" w:hAnsi="Calibri"/>
+                <w:b w:val="false"/>
+                <w:bCs w:val="false"/>
+                <w:sz w:val="16"/>
+                <w:szCs w:val="16"/>
+              </w:rPr>
+              <w:t xml:space="preserve">Cantidad -3, total -$ 26.550 y contador -3.</w:t>
+            </w:r>
+          </w:p>
+        </w:tc>
+        <w:tc>
+          <w:tcPr>
+            <w:tcW w:type="dxa" w:w="4900"/>
+            <w:tcBorders>
+              <w:top w:val="single" w:color="999999" w:sz="4"/>
+              <w:left w:val="single" w:color="999999" w:sz="4"/>
+              <w:bottom w:val="single" w:color="999999" w:sz="4"/>
+              <w:right w:val="single" w:color="999999" w:sz="4"/>
+            </w:tcBorders>
+            <w:tcMar>
+              <w:top w:type="dxa" w:w="60"/>
+              <w:left w:type="dxa" w:w="80"/>
+              <w:bottom w:type="dxa" w:w="60"/>
+              <w:right w:type="dxa" w:w="80"/>
+            </w:tcMar>
+            <w:vAlign w:val="center"/>
+          </w:tcPr>
+          <w:p>
+            <w:pPr>
+              <w:spacing w:after="0"/>
+              <w:jc w:val="left"/>
+            </w:pPr>
+            <w:r>
+              <w:rPr>
+                <w:rFonts w:ascii="Calibri" w:cs="Calibri" w:eastAsia="Calibri" w:hAnsi="Calibri"/>
+                <w:b w:val="false"/>
+                <w:bCs w:val="false"/>
+                <w:sz w:val="16"/>
+                <w:szCs w:val="16"/>
+              </w:rPr>
+              <w:t xml:space="preserve">El ítem con cantidad -3 se descarta: carrito vacío, total $ 0 y contador 0.</w:t>
+            </w:r>
+          </w:p>
+        </w:tc>
+        <w:tc>
+          <w:tcPr>
+            <w:tcW w:type="dxa" w:w="2458"/>
+            <w:tcBorders>
+              <w:top w:val="single" w:color="999999" w:sz="4"/>
+              <w:left w:val="single" w:color="999999" w:sz="4"/>
+              <w:bottom w:val="single" w:color="999999" w:sz="4"/>
+              <w:right w:val="single" w:color="999999" w:sz="4"/>
+            </w:tcBorders>
+            <w:tcMar>
+              <w:top w:type="dxa" w:w="60"/>
+              <w:left w:type="dxa" w:w="80"/>
+              <w:bottom w:type="dxa" w:w="60"/>
+              <w:right w:type="dxa" w:w="80"/>
+            </w:tcMar>
+            <w:vAlign w:val="center"/>
+          </w:tcPr>
+          <w:p>
+            <w:pPr>
+              <w:spacing w:after="0"/>
+              <w:jc w:val="left"/>
+            </w:pPr>
+            <w:r>
+              <w:rPr>
+                <w:rFonts w:ascii="Calibri" w:cs="Calibri" w:eastAsia="Calibri" w:hAnsi="Calibri"/>
+                <w:b w:val="false"/>
+                <w:bCs w:val="false"/>
+                <w:sz w:val="16"/>
+                <w:szCs w:val="16"/>
+              </w:rPr>
+              <w:t xml:space="preserve">fix: descartar cantidades inválidas al leer el carrito</w:t>
+            </w:r>
+          </w:p>
+        </w:tc>
+        <w:tc>
+          <w:tcPr>
+            <w:tcW w:type="dxa" w:w="1000"/>
+            <w:tcBorders>
+              <w:top w:val="single" w:color="999999" w:sz="4"/>
+              <w:left w:val="single" w:color="999999" w:sz="4"/>
+              <w:bottom w:val="single" w:color="999999" w:sz="4"/>
+              <w:right w:val="single" w:color="999999" w:sz="4"/>
+            </w:tcBorders>
+            <w:tcMar>
+              <w:top w:type="dxa" w:w="60"/>
+              <w:left w:type="dxa" w:w="80"/>
+              <w:bottom w:type="dxa" w:w="60"/>
+              <w:right w:type="dxa" w:w="80"/>
+            </w:tcMar>
+            <w:vAlign w:val="center"/>
+          </w:tcPr>
+          <w:p>
+            <w:pPr>
+              <w:spacing w:after="0"/>
+              <w:jc w:val="center"/>
+            </w:pPr>
+            <w:r>
+              <w:rPr>
+                <w:rFonts w:ascii="Calibri" w:cs="Calibri" w:eastAsia="Calibri" w:hAnsi="Calibri"/>
+                <w:b w:val="false"/>
+                <w:bCs w:val="false"/>
+                <w:sz w:val="16"/>
+                <w:szCs w:val="16"/>
+              </w:rPr>
+              <w:t xml:space="preserve">Aprobado</w:t>
+            </w:r>
+          </w:p>
+        </w:tc>
+      </w:tr>
+      <w:tr>
+        <w:trPr>
+          <w:cantSplit/>
+        </w:trPr>
+        <w:tc>
+          <w:tcPr>
+            <w:tcW w:type="dxa" w:w="1400"/>
+            <w:tcBorders>
+              <w:top w:val="single" w:color="999999" w:sz="4"/>
+              <w:left w:val="single" w:color="999999" w:sz="4"/>
+              <w:bottom w:val="single" w:color="999999" w:sz="4"/>
+              <w:right w:val="single" w:color="999999" w:sz="4"/>
+            </w:tcBorders>
+            <w:shd w:fill="FBF6EA" w:color="auto" w:val="clear"/>
+            <w:tcMar>
+              <w:top w:type="dxa" w:w="60"/>
+              <w:left w:type="dxa" w:w="80"/>
+              <w:bottom w:type="dxa" w:w="60"/>
+              <w:right w:type="dxa" w:w="80"/>
+            </w:tcMar>
+            <w:vAlign w:val="center"/>
+          </w:tcPr>
+          <w:p>
+            <w:pPr>
+              <w:spacing w:after="0"/>
+              <w:jc w:val="center"/>
+            </w:pPr>
+            <w:r>
+              <w:rPr>
+                <w:rFonts w:ascii="Calibri" w:cs="Calibri" w:eastAsia="Calibri" w:hAnsi="Calibri"/>
+                <w:b/>
+                <w:bCs/>
+                <w:sz w:val="16"/>
+                <w:szCs w:val="16"/>
+              </w:rPr>
+              <w:t xml:space="preserve">CP-REG-05</w:t>
+            </w:r>
+          </w:p>
+        </w:tc>
+        <w:tc>
+          <w:tcPr>
+            <w:tcW w:type="dxa" w:w="4200"/>
+            <w:tcBorders>
+              <w:top w:val="single" w:color="999999" w:sz="4"/>
+              <w:left w:val="single" w:color="999999" w:sz="4"/>
+              <w:bottom w:val="single" w:color="999999" w:sz="4"/>
+              <w:right w:val="single" w:color="999999" w:sz="4"/>
+            </w:tcBorders>
+            <w:shd w:fill="FBF6EA" w:color="auto" w:val="clear"/>
+            <w:tcMar>
+              <w:top w:type="dxa" w:w="60"/>
+              <w:left w:type="dxa" w:w="80"/>
+              <w:bottom w:type="dxa" w:w="60"/>
+              <w:right w:type="dxa" w:w="80"/>
+            </w:tcMar>
+            <w:vAlign w:val="center"/>
+          </w:tcPr>
+          <w:p>
+            <w:pPr>
+              <w:spacing w:after="0"/>
+              <w:jc w:val="left"/>
+            </w:pPr>
+            <w:r>
+              <w:rPr>
+                <w:rFonts w:ascii="Calibri" w:cs="Calibri" w:eastAsia="Calibri" w:hAnsi="Calibri"/>
+                <w:b w:val="false"/>
+                <w:bCs w:val="false"/>
+                <w:sz w:val="16"/>
+                <w:szCs w:val="16"/>
+              </w:rPr>
+              <w:t xml:space="preserve">Se aceptó "hola" como N.º de pedido y se generó el código.</w:t>
+            </w:r>
+          </w:p>
+        </w:tc>
+        <w:tc>
+          <w:tcPr>
+            <w:tcW w:type="dxa" w:w="4900"/>
+            <w:tcBorders>
+              <w:top w:val="single" w:color="999999" w:sz="4"/>
+              <w:left w:val="single" w:color="999999" w:sz="4"/>
+              <w:bottom w:val="single" w:color="999999" w:sz="4"/>
+              <w:right w:val="single" w:color="999999" w:sz="4"/>
+            </w:tcBorders>
+            <w:shd w:fill="FBF6EA" w:color="auto" w:val="clear"/>
+            <w:tcMar>
+              <w:top w:type="dxa" w:w="60"/>
+              <w:left w:type="dxa" w:w="80"/>
+              <w:bottom w:type="dxa" w:w="60"/>
+              <w:right w:type="dxa" w:w="80"/>
+            </w:tcMar>
+            <w:vAlign w:val="center"/>
+          </w:tcPr>
+          <w:p>
+            <w:pPr>
+              <w:spacing w:after="0"/>
+              <w:jc w:val="left"/>
+            </w:pPr>
+            <w:r>
+              <w:rPr>
+                <w:rFonts w:ascii="Calibri" w:cs="Calibri" w:eastAsia="Calibri" w:hAnsi="Calibri"/>
+                <w:b w:val="false"/>
+                <w:bCs w:val="false"/>
+                <w:sz w:val="16"/>
+                <w:szCs w:val="16"/>
+              </w:rPr>
+              <w:t xml:space="preserve">El navegador rechaza "hola" e indica el formato LP- seguido de 6 números. Con LP-004821 el código se genera normalmente (CP-REG-04).</w:t>
+            </w:r>
+          </w:p>
+        </w:tc>
+        <w:tc>
+          <w:tcPr>
+            <w:tcW w:type="dxa" w:w="2458"/>
+            <w:tcBorders>
+              <w:top w:val="single" w:color="999999" w:sz="4"/>
+              <w:left w:val="single" w:color="999999" w:sz="4"/>
+              <w:bottom w:val="single" w:color="999999" w:sz="4"/>
+              <w:right w:val="single" w:color="999999" w:sz="4"/>
+            </w:tcBorders>
+            <w:shd w:fill="FBF6EA" w:color="auto" w:val="clear"/>
+            <w:tcMar>
+              <w:top w:type="dxa" w:w="60"/>
+              <w:left w:type="dxa" w:w="80"/>
+              <w:bottom w:type="dxa" w:w="60"/>
+              <w:right w:type="dxa" w:w="80"/>
+            </w:tcMar>
+            <w:vAlign w:val="center"/>
+          </w:tcPr>
+          <w:p>
+            <w:pPr>
+              <w:spacing w:after="0"/>
+              <w:jc w:val="left"/>
+            </w:pPr>
+            <w:r>
+              <w:rPr>
+                <w:rFonts w:ascii="Calibri" w:cs="Calibri" w:eastAsia="Calibri" w:hAnsi="Calibri"/>
+                <w:b w:val="false"/>
+                <w:bCs w:val="false"/>
+                <w:sz w:val="16"/>
+                <w:szCs w:val="16"/>
+              </w:rPr>
+              <w:t xml:space="preserve">fix: exigir el formato LP-000000</w:t>
+            </w:r>
+          </w:p>
+        </w:tc>
+        <w:tc>
+          <w:tcPr>
+            <w:tcW w:type="dxa" w:w="1000"/>
+            <w:tcBorders>
+              <w:top w:val="single" w:color="999999" w:sz="4"/>
+              <w:left w:val="single" w:color="999999" w:sz="4"/>
+              <w:bottom w:val="single" w:color="999999" w:sz="4"/>
+              <w:right w:val="single" w:color="999999" w:sz="4"/>
+            </w:tcBorders>
+            <w:shd w:fill="FBF6EA" w:color="auto" w:val="clear"/>
+            <w:tcMar>
+              <w:top w:type="dxa" w:w="60"/>
+              <w:left w:type="dxa" w:w="80"/>
+              <w:bottom w:type="dxa" w:w="60"/>
+              <w:right w:type="dxa" w:w="80"/>
+            </w:tcMar>
+            <w:vAlign w:val="center"/>
+          </w:tcPr>
+          <w:p>
+            <w:pPr>
+              <w:spacing w:after="0"/>
+              <w:jc w:val="center"/>
+            </w:pPr>
+            <w:r>
+              <w:rPr>
+                <w:rFonts w:ascii="Calibri" w:cs="Calibri" w:eastAsia="Calibri" w:hAnsi="Calibri"/>
+                <w:b w:val="false"/>
+                <w:bCs w:val="false"/>
+                <w:sz w:val="16"/>
+                <w:szCs w:val="16"/>
+              </w:rPr>
+              <w:t xml:space="preserve">Aprobado</w:t>
+            </w:r>
+          </w:p>
+        </w:tc>
+      </w:tr>
+      <w:tr>
+        <w:trPr>
+          <w:cantSplit/>
+        </w:trPr>
+        <w:tc>
+          <w:tcPr>
+            <w:tcW w:type="dxa" w:w="1400"/>
+            <w:tcBorders>
+              <w:top w:val="single" w:color="999999" w:sz="4"/>
+              <w:left w:val="single" w:color="999999" w:sz="4"/>
+              <w:bottom w:val="single" w:color="999999" w:sz="4"/>
+              <w:right w:val="single" w:color="999999" w:sz="4"/>
+            </w:tcBorders>
+            <w:tcMar>
+              <w:top w:type="dxa" w:w="60"/>
+              <w:left w:type="dxa" w:w="80"/>
+              <w:bottom w:type="dxa" w:w="60"/>
+              <w:right w:type="dxa" w:w="80"/>
+            </w:tcMar>
+            <w:vAlign w:val="center"/>
+          </w:tcPr>
+          <w:p>
+            <w:pPr>
+              <w:spacing w:after="0"/>
+              <w:jc w:val="center"/>
+            </w:pPr>
+            <w:r>
+              <w:rPr>
+                <w:rFonts w:ascii="Calibri" w:cs="Calibri" w:eastAsia="Calibri" w:hAnsi="Calibri"/>
+                <w:b/>
+                <w:bCs/>
+                <w:sz w:val="16"/>
+                <w:szCs w:val="16"/>
+              </w:rPr>
+              <w:t xml:space="preserve">CP-RES-01</w:t>
+            </w:r>
+          </w:p>
+        </w:tc>
+        <w:tc>
+          <w:tcPr>
+            <w:tcW w:type="dxa" w:w="4200"/>
+            <w:tcBorders>
+              <w:top w:val="single" w:color="999999" w:sz="4"/>
+              <w:left w:val="single" w:color="999999" w:sz="4"/>
+              <w:bottom w:val="single" w:color="999999" w:sz="4"/>
+              <w:right w:val="single" w:color="999999" w:sz="4"/>
+            </w:tcBorders>
+            <w:tcMar>
+              <w:top w:type="dxa" w:w="60"/>
+              <w:left w:type="dxa" w:w="80"/>
+              <w:bottom w:type="dxa" w:w="60"/>
+              <w:right w:type="dxa" w:w="80"/>
+            </w:tcMar>
+            <w:vAlign w:val="center"/>
+          </w:tcPr>
+          <w:p>
+            <w:pPr>
+              <w:spacing w:after="0"/>
+              <w:jc w:val="left"/>
+            </w:pPr>
+            <w:r>
+              <w:rPr>
+                <w:rFonts w:ascii="Calibri" w:cs="Calibri" w:eastAsia="Calibri" w:hAnsi="Calibri"/>
+                <w:b w:val="false"/>
+                <w:bCs w:val="false"/>
+                <w:sz w:val="16"/>
+                <w:szCs w:val="16"/>
+              </w:rPr>
+              <w:t xml:space="preserve">Scroll horizontal de 118 px en terminos.html a 360 px.</w:t>
+            </w:r>
+          </w:p>
+        </w:tc>
+        <w:tc>
+          <w:tcPr>
+            <w:tcW w:type="dxa" w:w="4900"/>
+            <w:tcBorders>
+              <w:top w:val="single" w:color="999999" w:sz="4"/>
+              <w:left w:val="single" w:color="999999" w:sz="4"/>
+              <w:bottom w:val="single" w:color="999999" w:sz="4"/>
+              <w:right w:val="single" w:color="999999" w:sz="4"/>
+            </w:tcBorders>
+            <w:tcMar>
+              <w:top w:type="dxa" w:w="60"/>
+              <w:left w:type="dxa" w:w="80"/>
+              <w:bottom w:type="dxa" w:w="60"/>
+              <w:right w:type="dxa" w:w="80"/>
+            </w:tcMar>
+            <w:vAlign w:val="center"/>
+          </w:tcPr>
+          <w:p>
+            <w:pPr>
+              <w:spacing w:after="0"/>
+              <w:jc w:val="left"/>
+            </w:pPr>
+            <w:r>
+              <w:rPr>
+                <w:rFonts w:ascii="Calibri" w:cs="Calibri" w:eastAsia="Calibri" w:hAnsi="Calibri"/>
+                <w:b w:val="false"/>
+                <w:bCs w:val="false"/>
+                <w:sz w:val="16"/>
+                <w:szCs w:val="16"/>
+              </w:rPr>
+              <w:t xml:space="preserve">Sin scroll horizontal en las 9 páginas a 360 px.</w:t>
+            </w:r>
+          </w:p>
+        </w:tc>
+        <w:tc>
+          <w:tcPr>
+            <w:tcW w:type="dxa" w:w="2458"/>
+            <w:tcBorders>
+              <w:top w:val="single" w:color="999999" w:sz="4"/>
+              <w:left w:val="single" w:color="999999" w:sz="4"/>
+              <w:bottom w:val="single" w:color="999999" w:sz="4"/>
+              <w:right w:val="single" w:color="999999" w:sz="4"/>
+            </w:tcBorders>
+            <w:tcMar>
+              <w:top w:type="dxa" w:w="60"/>
+              <w:left w:type="dxa" w:w="80"/>
+              <w:bottom w:type="dxa" w:w="60"/>
+              <w:right w:type="dxa" w:w="80"/>
+            </w:tcMar>
+            <w:vAlign w:val="center"/>
+          </w:tcPr>
+          <w:p>
+            <w:pPr>
+              <w:spacing w:after="0"/>
+              <w:jc w:val="left"/>
+            </w:pPr>
+            <w:r>
+              <w:rPr>
+                <w:rFonts w:ascii="Calibri" w:cs="Calibri" w:eastAsia="Calibri" w:hAnsi="Calibri"/>
+                <w:b w:val="false"/>
+                <w:bCs w:val="false"/>
+                <w:sz w:val="16"/>
+                <w:szCs w:val="16"/>
+              </w:rPr>
+              <w:t xml:space="preserve">fix: cortar las URL largas del texto legal</w:t>
+            </w:r>
+          </w:p>
+        </w:tc>
+        <w:tc>
+          <w:tcPr>
+            <w:tcW w:type="dxa" w:w="1000"/>
+            <w:tcBorders>
+              <w:top w:val="single" w:color="999999" w:sz="4"/>
+              <w:left w:val="single" w:color="999999" w:sz="4"/>
+              <w:bottom w:val="single" w:color="999999" w:sz="4"/>
+              <w:right w:val="single" w:color="999999" w:sz="4"/>
+            </w:tcBorders>
+            <w:tcMar>
+              <w:top w:type="dxa" w:w="60"/>
+              <w:left w:type="dxa" w:w="80"/>
+              <w:bottom w:type="dxa" w:w="60"/>
+              <w:right w:type="dxa" w:w="80"/>
+            </w:tcMar>
+            <w:vAlign w:val="center"/>
+          </w:tcPr>
+          <w:p>
+            <w:pPr>
+              <w:spacing w:after="0"/>
+              <w:jc w:val="center"/>
+            </w:pPr>
+            <w:r>
+              <w:rPr>
+                <w:rFonts w:ascii="Calibri" w:cs="Calibri" w:eastAsia="Calibri" w:hAnsi="Calibri"/>
+                <w:b w:val="false"/>
+                <w:bCs w:val="false"/>
+                <w:sz w:val="16"/>
+                <w:szCs w:val="16"/>
+              </w:rPr>
+              <w:t xml:space="preserve">Aprobado</w:t>
+            </w:r>
+          </w:p>
+        </w:tc>
+      </w:tr>
+    </w:tbl>
+    <w:p>
+      <w:pPr>
+        <w:spacing w:before="60" w:after="240" w:line="276"/>
+      </w:pPr>
+      <w:r>
+        <w:rPr>
+          <w:rFonts w:ascii="Calibri" w:cs="Calibri" w:eastAsia="Calibri" w:hAnsi="Calibri"/>
+          <w:i/>
+          <w:iCs/>
+          <w:sz w:val="18"/>
+          <w:szCs w:val="18"/>
+        </w:rPr>
+        <w:t xml:space="preserve">Nota. </w:t>
+      </w:r>
+      <w:r>
+        <w:rPr>
+          <w:rFonts w:ascii="Calibri" w:cs="Calibri" w:eastAsia="Calibri" w:hAnsi="Calibri"/>
+          <w:sz w:val="18"/>
+          <w:szCs w:val="18"/>
+        </w:rPr>
+        <w:t xml:space="preserve">El resto de los casos mantuvo el mismo estado que en la primera ejecución.</w:t>
+      </w:r>
+    </w:p>
     <w:p>
       <w:pPr>
         <w:pStyle w:val="Heading2"/>

</xml_diff>

<commit_message>
docs: re-ejecución del plan de pruebas tras el rediseño visual (#75)
Co-Authored-By: Claude Opus 5.5 <noreply@anthropic.com>
</commit_message>
<xml_diff>
--- a/docs/Sprint 3/Plan_de_Casos_de_Prueba_Sprint3_Los_Primos.docx
+++ b/docs/Sprint 3/Plan_de_Casos_de_Prueba_Sprint3_Los_Primos.docx
@@ -23430,6 +23430,66 @@
           <w:szCs w:val="18"/>
         </w:rPr>
         <w:t xml:space="preserve">El resto de los casos mantuvo el mismo estado que en la primera ejecución.</w:t>
+      </w:r>
+    </w:p>
+    <w:p>
+      <w:pPr>
+        <w:pStyle w:val="Heading2"/>
+        <w:keepNext/>
+        <w:spacing w:before="240" w:after="0" w:line="480"/>
+        <w:jc w:val="center"/>
+      </w:pPr>
+      <w:r>
+        <w:rPr>
+          <w:rFonts w:ascii="Calibri" w:cs="Calibri" w:eastAsia="Calibri" w:hAnsi="Calibri"/>
+          <w:b/>
+          <w:bCs/>
+          <w:sz w:val="22"/>
+          <w:szCs w:val="22"/>
+        </w:rPr>
+        <w:t xml:space="preserve">7. Re-ejecución tras el rediseño visual</w:t>
+      </w:r>
+    </w:p>
+    <w:p>
+      <w:pPr>
+        <w:spacing w:after="0" w:line="480"/>
+        <w:ind w:firstLine="720"/>
+      </w:pPr>
+      <w:r>
+        <w:rPr>
+          <w:rFonts w:ascii="Calibri" w:cs="Calibri" w:eastAsia="Calibri" w:hAnsi="Calibri"/>
+          <w:sz w:val="22"/>
+          <w:szCs w:val="22"/>
+        </w:rPr>
+        <w:t xml:space="preserve">El 22/10/2026 se implementó el rediseño visual del sitio (solicitud de cambio CR-05, issue #75 del repositorio, Pull Request #80). Como modifica la hoja de estilos, el header de todas las páginas y dos archivos de JavaScript (js/catalogo.js y js/carrito.js), se volvió a ejecutar el plan completo de 63 casos con el mismo script y el mismo entorno, como prueba de regresión.</w:t>
+      </w:r>
+    </w:p>
+    <w:p>
+      <w:pPr>
+        <w:spacing w:after="0" w:line="480"/>
+        <w:ind w:firstLine="720"/>
+      </w:pPr>
+      <w:r>
+        <w:rPr>
+          <w:rFonts w:ascii="Calibri" w:cs="Calibri" w:eastAsia="Calibri" w:hAnsi="Calibri"/>
+          <w:sz w:val="22"/>
+          <w:szCs w:val="22"/>
+        </w:rPr>
+        <w:t xml:space="preserve">En la primera corrida fallaron los casos CP-RES-01, CP-RES-02 y CP-RES-03: la cinta animada y el hexágono decorativo del inicio sobresalían del ancho de la pantalla mientras se movían y generaban scroll horizontal. Se corrigió recortando el desborde en la sección de inicio (overflow-x: clip) y los tres casos se aprobaron al repetirlos.</w:t>
+      </w:r>
+    </w:p>
+    <w:p>
+      <w:pPr>
+        <w:spacing w:after="0" w:line="480"/>
+        <w:ind w:firstLine="720"/>
+      </w:pPr>
+      <w:r>
+        <w:rPr>
+          <w:rFonts w:ascii="Calibri" w:cs="Calibri" w:eastAsia="Calibri" w:hAnsi="Calibri"/>
+          <w:sz w:val="22"/>
+          <w:szCs w:val="22"/>
+        </w:rPr>
+        <w:t xml:space="preserve">Resultado final: 62 casos aprobados, 0 fallidos y 1 pendiente (CP-RES-07, que requiere un celular real), el mismo resultado que la re-ejecución del 20/10. El rediseño además resolvió la observación sobre el foco visible de la Tabla 11: el contorno pasó al ámbar oscuro #A0680F, que supera el contraste de 3:1 sobre el fondo crema. También se verificaron las funciones nuevas: el botón "+" de las tarjetas del inicio agrega el producto sin abrir el detalle, el aviso flotante se anuncia con role="status" y se oculta a los 2,4 segundos, y el contador del carrito se anima solo cuando se suman productos.</w:t>
       </w:r>
     </w:p>
     <w:p>

</xml_diff>